<commit_message>
added quiz 3 solution, update lectures 7 and 8
</commit_message>
<xml_diff>
--- a/quizzes_exit_tickets/Quiz03/Quiz03_Solution.docx
+++ b/quizzes_exit_tickets/Quiz03/Quiz03_Solution.docx
@@ -308,166 +308,36 @@
         <w:rPr>
           <w:rFonts w:eastAsiaTheme="minorEastAsia"/>
         </w:rPr>
-        <w:t xml:space="preserve">. Does </w:t>
-      </w:r>
-      <w:proofErr w:type="gramStart"/>
-      <w:r>
-        <w:rPr>
-          <w:rFonts w:eastAsiaTheme="minorEastAsia"/>
-        </w:rPr>
-        <w:t>the DTFT</w:t>
-      </w:r>
-      <w:proofErr w:type="gramEnd"/>
-      <w:r>
-        <w:rPr>
-          <w:rFonts w:eastAsiaTheme="minorEastAsia"/>
-        </w:rPr>
-        <w:t xml:space="preserve"> exist? Is the corresponding sequence right-sided or left-sided?</w:t>
+        <w:t>. Does the DTFT exist? Is the corresponding sequence right-sided or left-sided?</w:t>
       </w:r>
     </w:p>
     <w:p>
       <w:pPr>
         <w:spacing w:after="80"/>
         <w:rPr>
-          <w:b/>
-          <w:bCs/>
+          <w:rFonts w:eastAsiaTheme="minorEastAsia"/>
+          <w:color w:val="EE0000"/>
         </w:rPr>
       </w:pPr>
-    </w:p>
-    <w:p>
-      <w:pPr>
-        <w:spacing w:after="80"/>
-        <w:rPr>
-          <w:b/>
-          <w:bCs/>
-        </w:rPr>
-      </w:pPr>
-    </w:p>
-    <w:p>
-      <w:pPr>
-        <w:spacing w:after="80"/>
+      <w:r>
+        <w:rPr>
+          <w:color w:val="EE0000"/>
+        </w:rPr>
+        <w:t xml:space="preserve">Pole at </w:t>
+      </w:r>
+      <m:oMath>
+        <m:r>
+          <w:rPr>
+            <w:rFonts w:ascii="Cambria Math" w:hAnsi="Cambria Math"/>
+            <w:color w:val="EE0000"/>
+          </w:rPr>
+          <m:t>z=1.25</m:t>
+        </m:r>
+      </m:oMath>
+      <w:r>
         <w:rPr>
           <w:rFonts w:eastAsiaTheme="minorEastAsia"/>
-          <w:b/>
-          <w:bCs/>
-        </w:rPr>
-      </w:pPr>
-      <w:r>
-        <w:rPr>
-          <w:b/>
-          <w:bCs/>
-        </w:rPr>
-        <w:t>2</w:t>
-      </w:r>
-      <w:r>
-        <w:rPr>
-          <w:b/>
-          <w:bCs/>
-        </w:rPr>
-        <w:t xml:space="preserve">. </w:t>
-      </w:r>
-      <w:r>
-        <w:rPr>
-          <w:b/>
-          <w:bCs/>
-        </w:rPr>
-        <w:t>Inverse z-transform</w:t>
-      </w:r>
-    </w:p>
-    <w:p>
-      <w:pPr>
-        <w:spacing w:after="80"/>
-        <w:rPr>
-          <w:rFonts w:eastAsiaTheme="minorEastAsia"/>
-        </w:rPr>
-      </w:pPr>
-      <w:r>
-        <w:t>F</w:t>
-      </w:r>
-      <w:r>
-        <w:t xml:space="preserve">ind </w:t>
-      </w:r>
-      <m:oMath>
-        <m:r>
-          <w:rPr>
-            <w:rFonts w:ascii="Cambria Math" w:hAnsi="Cambria Math"/>
-          </w:rPr>
-          <m:t>x[n]</m:t>
-        </m:r>
-      </m:oMath>
-      <w:r>
-        <w:rPr>
-          <w:rFonts w:eastAsiaTheme="minorEastAsia"/>
-        </w:rPr>
-        <w:t xml:space="preserve"> for </w:t>
-      </w:r>
-      <m:oMath>
-        <m:r>
-          <w:rPr>
-            <w:rFonts w:ascii="Cambria Math" w:eastAsiaTheme="minorEastAsia" w:hAnsi="Cambria Math"/>
-          </w:rPr>
-          <m:t>X</m:t>
-        </m:r>
-        <m:d>
-          <m:dPr>
-            <m:ctrlPr>
-              <w:rPr>
-                <w:rFonts w:ascii="Cambria Math" w:eastAsiaTheme="minorEastAsia" w:hAnsi="Cambria Math"/>
-                <w:i/>
-              </w:rPr>
-            </m:ctrlPr>
-          </m:dPr>
-          <m:e>
-            <m:r>
-              <w:rPr>
-                <w:rFonts w:ascii="Cambria Math" w:eastAsiaTheme="minorEastAsia" w:hAnsi="Cambria Math"/>
-              </w:rPr>
-              <m:t>z</m:t>
-            </m:r>
-          </m:e>
-        </m:d>
-        <m:r>
-          <w:rPr>
-            <w:rFonts w:ascii="Cambria Math" w:eastAsiaTheme="minorEastAsia" w:hAnsi="Cambria Math"/>
-          </w:rPr>
-          <m:t>=1/(1-0.6</m:t>
-        </m:r>
-        <m:sSup>
-          <m:sSupPr>
-            <m:ctrlPr>
-              <w:rPr>
-                <w:rFonts w:ascii="Cambria Math" w:eastAsiaTheme="minorEastAsia" w:hAnsi="Cambria Math"/>
-                <w:i/>
-              </w:rPr>
-            </m:ctrlPr>
-          </m:sSupPr>
-          <m:e>
-            <m:r>
-              <w:rPr>
-                <w:rFonts w:ascii="Cambria Math" w:eastAsiaTheme="minorEastAsia" w:hAnsi="Cambria Math"/>
-              </w:rPr>
-              <m:t>z</m:t>
-            </m:r>
-          </m:e>
-          <m:sup>
-            <m:r>
-              <w:rPr>
-                <w:rFonts w:ascii="Cambria Math" w:eastAsiaTheme="minorEastAsia" w:hAnsi="Cambria Math"/>
-              </w:rPr>
-              <m:t>-1</m:t>
-            </m:r>
-          </m:sup>
-        </m:sSup>
-        <m:r>
-          <w:rPr>
-            <w:rFonts w:ascii="Cambria Math" w:eastAsiaTheme="minorEastAsia" w:hAnsi="Cambria Math"/>
-          </w:rPr>
-          <m:t>)</m:t>
-        </m:r>
-      </m:oMath>
-      <w:r>
-        <w:rPr>
-          <w:rFonts w:eastAsiaTheme="minorEastAsia"/>
+          <w:color w:val="EE0000"/>
         </w:rPr>
         <w:t xml:space="preserve">, ROC </w:t>
       </w:r>
@@ -480,6 +350,7 @@
               <w:rPr>
                 <w:rFonts w:ascii="Cambria Math" w:eastAsiaTheme="minorEastAsia" w:hAnsi="Cambria Math"/>
                 <w:i/>
+                <w:color w:val="EE0000"/>
               </w:rPr>
             </m:ctrlPr>
           </m:dPr>
@@ -487,6 +358,7 @@
             <m:r>
               <w:rPr>
                 <w:rFonts w:ascii="Cambria Math" w:eastAsiaTheme="minorEastAsia" w:hAnsi="Cambria Math"/>
+                <w:color w:val="EE0000"/>
               </w:rPr>
               <m:t>z</m:t>
             </m:r>
@@ -495,22 +367,24 @@
         <m:r>
           <w:rPr>
             <w:rFonts w:ascii="Cambria Math" w:eastAsiaTheme="minorEastAsia" w:hAnsi="Cambria Math"/>
-          </w:rPr>
-          <m:t>&gt;0.6</m:t>
+            <w:color w:val="EE0000"/>
+          </w:rPr>
+          <m:t>&lt;1.25</m:t>
         </m:r>
       </m:oMath>
       <w:r>
         <w:rPr>
           <w:rFonts w:eastAsiaTheme="minorEastAsia"/>
-        </w:rPr>
-        <w:t>.</w:t>
+          <w:color w:val="EE0000"/>
+        </w:rPr>
+        <w:t xml:space="preserve"> implies left-sided sequence and unit circle in ROC =&gt; DTFT exists.</w:t>
       </w:r>
     </w:p>
     <w:p>
       <w:pPr>
         <w:spacing w:after="80"/>
         <w:rPr>
-          <w:rFonts w:eastAsiaTheme="minorEastAsia"/>
+          <w:color w:val="EE0000"/>
         </w:rPr>
       </w:pPr>
     </w:p>
@@ -519,6 +393,273 @@
         <w:spacing w:after="80"/>
         <w:rPr>
           <w:rFonts w:eastAsiaTheme="minorEastAsia"/>
+          <w:b/>
+          <w:bCs/>
+        </w:rPr>
+      </w:pPr>
+      <w:r>
+        <w:rPr>
+          <w:b/>
+          <w:bCs/>
+        </w:rPr>
+        <w:t>2</w:t>
+      </w:r>
+      <w:r>
+        <w:rPr>
+          <w:b/>
+          <w:bCs/>
+        </w:rPr>
+        <w:t xml:space="preserve">. </w:t>
+      </w:r>
+      <w:r>
+        <w:rPr>
+          <w:b/>
+          <w:bCs/>
+        </w:rPr>
+        <w:t>Inverse z-transform</w:t>
+      </w:r>
+    </w:p>
+    <w:p>
+      <w:pPr>
+        <w:spacing w:after="80"/>
+        <w:rPr>
+          <w:rFonts w:eastAsiaTheme="minorEastAsia"/>
+          <w:color w:val="EE0000"/>
+        </w:rPr>
+      </w:pPr>
+      <w:r>
+        <w:t>F</w:t>
+      </w:r>
+      <w:r>
+        <w:t xml:space="preserve">ind </w:t>
+      </w:r>
+      <m:oMath>
+        <m:r>
+          <w:rPr>
+            <w:rFonts w:ascii="Cambria Math" w:hAnsi="Cambria Math"/>
+          </w:rPr>
+          <m:t>x[n]</m:t>
+        </m:r>
+      </m:oMath>
+      <w:r>
+        <w:rPr>
+          <w:rFonts w:eastAsiaTheme="minorEastAsia"/>
+        </w:rPr>
+        <w:t xml:space="preserve"> for </w:t>
+      </w:r>
+      <m:oMath>
+        <m:r>
+          <w:rPr>
+            <w:rFonts w:ascii="Cambria Math" w:eastAsiaTheme="minorEastAsia" w:hAnsi="Cambria Math"/>
+          </w:rPr>
+          <m:t>X</m:t>
+        </m:r>
+        <m:d>
+          <m:dPr>
+            <m:ctrlPr>
+              <w:rPr>
+                <w:rFonts w:ascii="Cambria Math" w:eastAsiaTheme="minorEastAsia" w:hAnsi="Cambria Math"/>
+                <w:i/>
+              </w:rPr>
+            </m:ctrlPr>
+          </m:dPr>
+          <m:e>
+            <m:r>
+              <w:rPr>
+                <w:rFonts w:ascii="Cambria Math" w:eastAsiaTheme="minorEastAsia" w:hAnsi="Cambria Math"/>
+              </w:rPr>
+              <m:t>z</m:t>
+            </m:r>
+          </m:e>
+        </m:d>
+        <m:r>
+          <w:rPr>
+            <w:rFonts w:ascii="Cambria Math" w:eastAsiaTheme="minorEastAsia" w:hAnsi="Cambria Math"/>
+          </w:rPr>
+          <m:t>=1/(1-0.6</m:t>
+        </m:r>
+        <m:sSup>
+          <m:sSupPr>
+            <m:ctrlPr>
+              <w:rPr>
+                <w:rFonts w:ascii="Cambria Math" w:eastAsiaTheme="minorEastAsia" w:hAnsi="Cambria Math"/>
+                <w:i/>
+              </w:rPr>
+            </m:ctrlPr>
+          </m:sSupPr>
+          <m:e>
+            <m:r>
+              <w:rPr>
+                <w:rFonts w:ascii="Cambria Math" w:eastAsiaTheme="minorEastAsia" w:hAnsi="Cambria Math"/>
+              </w:rPr>
+              <m:t>z</m:t>
+            </m:r>
+          </m:e>
+          <m:sup>
+            <m:r>
+              <w:rPr>
+                <w:rFonts w:ascii="Cambria Math" w:eastAsiaTheme="minorEastAsia" w:hAnsi="Cambria Math"/>
+              </w:rPr>
+              <m:t>-1</m:t>
+            </m:r>
+          </m:sup>
+        </m:sSup>
+        <m:r>
+          <w:rPr>
+            <w:rFonts w:ascii="Cambria Math" w:eastAsiaTheme="minorEastAsia" w:hAnsi="Cambria Math"/>
+          </w:rPr>
+          <m:t>)</m:t>
+        </m:r>
+      </m:oMath>
+      <w:r>
+        <w:rPr>
+          <w:rFonts w:eastAsiaTheme="minorEastAsia"/>
+        </w:rPr>
+        <w:t xml:space="preserve">, ROC </w:t>
+      </w:r>
+      <m:oMath>
+        <m:d>
+          <m:dPr>
+            <m:begChr m:val="|"/>
+            <m:endChr m:val="|"/>
+            <m:ctrlPr>
+              <w:rPr>
+                <w:rFonts w:ascii="Cambria Math" w:eastAsiaTheme="minorEastAsia" w:hAnsi="Cambria Math"/>
+                <w:i/>
+              </w:rPr>
+            </m:ctrlPr>
+          </m:dPr>
+          <m:e>
+            <m:r>
+              <w:rPr>
+                <w:rFonts w:ascii="Cambria Math" w:eastAsiaTheme="minorEastAsia" w:hAnsi="Cambria Math"/>
+              </w:rPr>
+              <m:t>z</m:t>
+            </m:r>
+          </m:e>
+        </m:d>
+        <m:r>
+          <w:rPr>
+            <w:rFonts w:ascii="Cambria Math" w:eastAsiaTheme="minorEastAsia" w:hAnsi="Cambria Math"/>
+          </w:rPr>
+          <m:t>&gt;0.6</m:t>
+        </m:r>
+      </m:oMath>
+      <w:r>
+        <w:rPr>
+          <w:rFonts w:eastAsiaTheme="minorEastAsia"/>
+        </w:rPr>
+        <w:t>.</w:t>
+      </w:r>
+    </w:p>
+    <w:p>
+      <w:pPr>
+        <w:spacing w:after="80"/>
+        <w:rPr>
+          <w:rFonts w:eastAsiaTheme="minorEastAsia"/>
+          <w:color w:val="EE0000"/>
+        </w:rPr>
+      </w:pPr>
+      <m:oMath>
+        <m:r>
+          <w:rPr>
+            <w:rFonts w:ascii="Cambria Math" w:eastAsiaTheme="minorEastAsia" w:hAnsi="Cambria Math"/>
+            <w:color w:val="EE0000"/>
+          </w:rPr>
+          <m:t>x</m:t>
+        </m:r>
+        <m:d>
+          <m:dPr>
+            <m:begChr m:val="["/>
+            <m:endChr m:val="]"/>
+            <m:ctrlPr>
+              <w:rPr>
+                <w:rFonts w:ascii="Cambria Math" w:eastAsiaTheme="minorEastAsia" w:hAnsi="Cambria Math"/>
+                <w:i/>
+                <w:color w:val="EE0000"/>
+              </w:rPr>
+            </m:ctrlPr>
+          </m:dPr>
+          <m:e>
+            <m:r>
+              <w:rPr>
+                <w:rFonts w:ascii="Cambria Math" w:eastAsiaTheme="minorEastAsia" w:hAnsi="Cambria Math"/>
+                <w:color w:val="EE0000"/>
+              </w:rPr>
+              <m:t>n</m:t>
+            </m:r>
+          </m:e>
+        </m:d>
+        <m:r>
+          <w:rPr>
+            <w:rFonts w:ascii="Cambria Math" w:eastAsiaTheme="minorEastAsia" w:hAnsi="Cambria Math"/>
+            <w:color w:val="EE0000"/>
+          </w:rPr>
+          <m:t>=</m:t>
+        </m:r>
+        <m:sSup>
+          <m:sSupPr>
+            <m:ctrlPr>
+              <w:rPr>
+                <w:rFonts w:ascii="Cambria Math" w:eastAsiaTheme="minorEastAsia" w:hAnsi="Cambria Math"/>
+                <w:i/>
+                <w:color w:val="EE0000"/>
+              </w:rPr>
+            </m:ctrlPr>
+          </m:sSupPr>
+          <m:e>
+            <m:d>
+              <m:dPr>
+                <m:ctrlPr>
+                  <w:rPr>
+                    <w:rFonts w:ascii="Cambria Math" w:eastAsiaTheme="minorEastAsia" w:hAnsi="Cambria Math"/>
+                    <w:i/>
+                    <w:color w:val="EE0000"/>
+                  </w:rPr>
+                </m:ctrlPr>
+              </m:dPr>
+              <m:e>
+                <m:r>
+                  <w:rPr>
+                    <w:rFonts w:ascii="Cambria Math" w:eastAsiaTheme="minorEastAsia" w:hAnsi="Cambria Math"/>
+                    <w:color w:val="EE0000"/>
+                  </w:rPr>
+                  <m:t>0.6</m:t>
+                </m:r>
+              </m:e>
+            </m:d>
+          </m:e>
+          <m:sup>
+            <m:r>
+              <w:rPr>
+                <w:rFonts w:ascii="Cambria Math" w:eastAsiaTheme="minorEastAsia" w:hAnsi="Cambria Math"/>
+                <w:color w:val="EE0000"/>
+              </w:rPr>
+              <m:t>n</m:t>
+            </m:r>
+          </m:sup>
+        </m:sSup>
+        <m:r>
+          <w:rPr>
+            <w:rFonts w:ascii="Cambria Math" w:eastAsiaTheme="minorEastAsia" w:hAnsi="Cambria Math"/>
+            <w:color w:val="EE0000"/>
+          </w:rPr>
+          <m:t>u[n]</m:t>
+        </m:r>
+      </m:oMath>
+      <w:r>
+        <w:rPr>
+          <w:rFonts w:eastAsiaTheme="minorEastAsia"/>
+          <w:color w:val="EE0000"/>
+        </w:rPr>
+        <w:t xml:space="preserve"> </w:t>
+      </w:r>
+    </w:p>
+    <w:p>
+      <w:pPr>
+        <w:spacing w:after="80"/>
+        <w:rPr>
+          <w:rFonts w:eastAsiaTheme="minorEastAsia"/>
         </w:rPr>
       </w:pPr>
     </w:p>
@@ -672,6 +813,220 @@
       <w:pPr>
         <w:spacing w:after="80"/>
         <w:rPr>
+          <w:color w:val="EE0000"/>
+        </w:rPr>
+      </w:pPr>
+      <m:oMath>
+        <m:r>
+          <w:rPr>
+            <w:rFonts w:ascii="Cambria Math" w:hAnsi="Cambria Math"/>
+            <w:color w:val="EE0000"/>
+          </w:rPr>
+          <m:t>H</m:t>
+        </m:r>
+        <m:d>
+          <m:dPr>
+            <m:ctrlPr>
+              <w:rPr>
+                <w:rFonts w:ascii="Cambria Math" w:hAnsi="Cambria Math"/>
+                <w:i/>
+                <w:color w:val="EE0000"/>
+              </w:rPr>
+            </m:ctrlPr>
+          </m:dPr>
+          <m:e>
+            <m:r>
+              <w:rPr>
+                <w:rFonts w:ascii="Cambria Math" w:hAnsi="Cambria Math"/>
+                <w:color w:val="EE0000"/>
+              </w:rPr>
+              <m:t>z</m:t>
+            </m:r>
+          </m:e>
+        </m:d>
+        <m:r>
+          <w:rPr>
+            <w:rFonts w:ascii="Cambria Math" w:hAnsi="Cambria Math"/>
+            <w:color w:val="EE0000"/>
+          </w:rPr>
+          <m:t>=</m:t>
+        </m:r>
+        <m:f>
+          <m:fPr>
+            <m:ctrlPr>
+              <w:rPr>
+                <w:rFonts w:ascii="Cambria Math" w:hAnsi="Cambria Math"/>
+                <w:i/>
+                <w:color w:val="EE0000"/>
+              </w:rPr>
+            </m:ctrlPr>
+          </m:fPr>
+          <m:num>
+            <m:r>
+              <w:rPr>
+                <w:rFonts w:ascii="Cambria Math" w:hAnsi="Cambria Math"/>
+                <w:color w:val="EE0000"/>
+              </w:rPr>
+              <m:t>1-</m:t>
+            </m:r>
+            <m:sSup>
+              <m:sSupPr>
+                <m:ctrlPr>
+                  <w:rPr>
+                    <w:rFonts w:ascii="Cambria Math" w:hAnsi="Cambria Math"/>
+                    <w:i/>
+                    <w:color w:val="EE0000"/>
+                  </w:rPr>
+                </m:ctrlPr>
+              </m:sSupPr>
+              <m:e>
+                <m:r>
+                  <w:rPr>
+                    <w:rFonts w:ascii="Cambria Math" w:hAnsi="Cambria Math"/>
+                    <w:color w:val="EE0000"/>
+                  </w:rPr>
+                  <m:t>z</m:t>
+                </m:r>
+              </m:e>
+              <m:sup>
+                <m:r>
+                  <w:rPr>
+                    <w:rFonts w:ascii="Cambria Math" w:hAnsi="Cambria Math"/>
+                    <w:color w:val="EE0000"/>
+                  </w:rPr>
+                  <m:t>-1</m:t>
+                </m:r>
+              </m:sup>
+            </m:sSup>
+          </m:num>
+          <m:den>
+            <m:r>
+              <w:rPr>
+                <w:rFonts w:ascii="Cambria Math" w:hAnsi="Cambria Math"/>
+                <w:color w:val="EE0000"/>
+              </w:rPr>
+              <m:t>1-0.5</m:t>
+            </m:r>
+            <m:sSup>
+              <m:sSupPr>
+                <m:ctrlPr>
+                  <w:rPr>
+                    <w:rFonts w:ascii="Cambria Math" w:hAnsi="Cambria Math"/>
+                    <w:i/>
+                    <w:color w:val="EE0000"/>
+                  </w:rPr>
+                </m:ctrlPr>
+              </m:sSupPr>
+              <m:e>
+                <m:r>
+                  <w:rPr>
+                    <w:rFonts w:ascii="Cambria Math" w:hAnsi="Cambria Math"/>
+                    <w:color w:val="EE0000"/>
+                  </w:rPr>
+                  <m:t>z</m:t>
+                </m:r>
+              </m:e>
+              <m:sup>
+                <m:r>
+                  <w:rPr>
+                    <w:rFonts w:ascii="Cambria Math" w:hAnsi="Cambria Math"/>
+                    <w:color w:val="EE0000"/>
+                  </w:rPr>
+                  <m:t>-1</m:t>
+                </m:r>
+              </m:sup>
+            </m:sSup>
+          </m:den>
+        </m:f>
+        <m:r>
+          <w:rPr>
+            <w:rFonts w:ascii="Cambria Math" w:hAnsi="Cambria Math"/>
+            <w:color w:val="EE0000"/>
+          </w:rPr>
+          <m:t>=</m:t>
+        </m:r>
+        <m:f>
+          <m:fPr>
+            <m:ctrlPr>
+              <w:rPr>
+                <w:rFonts w:ascii="Cambria Math" w:hAnsi="Cambria Math"/>
+                <w:i/>
+                <w:color w:val="EE0000"/>
+              </w:rPr>
+            </m:ctrlPr>
+          </m:fPr>
+          <m:num>
+            <m:r>
+              <w:rPr>
+                <w:rFonts w:ascii="Cambria Math" w:hAnsi="Cambria Math"/>
+                <w:color w:val="EE0000"/>
+              </w:rPr>
+              <m:t>z-1</m:t>
+            </m:r>
+          </m:num>
+          <m:den>
+            <m:r>
+              <w:rPr>
+                <w:rFonts w:ascii="Cambria Math" w:hAnsi="Cambria Math"/>
+                <w:color w:val="EE0000"/>
+              </w:rPr>
+              <m:t>z-0.5</m:t>
+            </m:r>
+          </m:den>
+        </m:f>
+      </m:oMath>
+      <w:r>
+        <w:rPr>
+          <w:rFonts w:eastAsiaTheme="minorEastAsia"/>
+          <w:color w:val="EE0000"/>
+        </w:rPr>
+        <w:t xml:space="preserve">  zero: </w:t>
+      </w:r>
+      <m:oMath>
+        <m:r>
+          <w:rPr>
+            <w:rFonts w:ascii="Cambria Math" w:eastAsiaTheme="minorEastAsia" w:hAnsi="Cambria Math"/>
+            <w:color w:val="EE0000"/>
+            <w:lang w:val="de-CH"/>
+          </w:rPr>
+          <m:t>z</m:t>
+        </m:r>
+        <m:r>
+          <w:rPr>
+            <w:rFonts w:ascii="Cambria Math" w:eastAsiaTheme="minorEastAsia" w:hAnsi="Cambria Math"/>
+            <w:color w:val="EE0000"/>
+          </w:rPr>
+          <m:t>=1</m:t>
+        </m:r>
+      </m:oMath>
+      <w:r>
+        <w:rPr>
+          <w:rFonts w:eastAsiaTheme="minorEastAsia"/>
+          <w:color w:val="EE0000"/>
+        </w:rPr>
+        <w:t xml:space="preserve">, pole: </w:t>
+      </w:r>
+      <m:oMath>
+        <m:r>
+          <w:rPr>
+            <w:rFonts w:ascii="Cambria Math" w:eastAsiaTheme="minorEastAsia" w:hAnsi="Cambria Math"/>
+            <w:color w:val="EE0000"/>
+          </w:rPr>
+          <m:t>z=0.5</m:t>
+        </m:r>
+      </m:oMath>
+      <w:r>
+        <w:rPr>
+          <w:rFonts w:eastAsiaTheme="minorEastAsia"/>
+          <w:color w:val="EE0000"/>
+        </w:rPr>
+        <w:t>.</w:t>
+      </w:r>
+    </w:p>
+    <w:p>
+      <w:pPr>
+        <w:spacing w:after="80"/>
+        <w:rPr>
           <w:b/>
           <w:bCs/>
         </w:rPr>
@@ -681,73 +1036,138 @@
       <w:pPr>
         <w:spacing w:after="80"/>
         <w:rPr>
+          <w:rFonts w:cstheme="minorHAnsi"/>
           <w:b/>
-          <w:bCs/>
+          <w:sz w:val="23"/>
         </w:rPr>
       </w:pPr>
+      <w:r>
+        <w:rPr>
+          <w:rFonts w:cstheme="minorHAnsi"/>
+          <w:b/>
+          <w:bCs/>
+        </w:rPr>
+        <w:t>4</w:t>
+      </w:r>
+      <w:r>
+        <w:rPr>
+          <w:rFonts w:cstheme="minorHAnsi"/>
+          <w:b/>
+          <w:bCs/>
+        </w:rPr>
+        <w:t xml:space="preserve">. </w:t>
+      </w:r>
+      <w:r>
+        <w:rPr>
+          <w:rFonts w:cstheme="minorHAnsi"/>
+          <w:b/>
+          <w:sz w:val="23"/>
+        </w:rPr>
+        <w:t>Causal and stable rule</w:t>
+      </w:r>
     </w:p>
     <w:p>
       <w:pPr>
         <w:spacing w:after="80"/>
         <w:rPr>
-          <w:rFonts w:cstheme="minorHAnsi"/>
-          <w:b/>
-          <w:sz w:val="23"/>
+          <w:rFonts w:ascii="Cambria Math" w:hAnsi="Cambria Math" w:cstheme="minorHAnsi"/>
+          <w:iCs/>
         </w:rPr>
       </w:pPr>
       <w:r>
         <w:rPr>
-          <w:rFonts w:cstheme="minorHAnsi"/>
-          <w:b/>
-          <w:bCs/>
-        </w:rPr>
-        <w:t>4</w:t>
-      </w:r>
-      <w:r>
-        <w:rPr>
-          <w:rFonts w:cstheme="minorHAnsi"/>
-          <w:b/>
-          <w:bCs/>
-        </w:rPr>
-        <w:t xml:space="preserve">. </w:t>
-      </w:r>
-      <w:r>
-        <w:rPr>
-          <w:rFonts w:cstheme="minorHAnsi"/>
-          <w:b/>
-          <w:sz w:val="23"/>
-        </w:rPr>
-        <w:t>Causal and stable rule</w:t>
+          <w:rFonts w:ascii="Cambria Math" w:hAnsi="Cambria Math" w:cstheme="minorHAnsi"/>
+          <w:iCs/>
+        </w:rPr>
+        <w:t xml:space="preserve">A </w:t>
+      </w:r>
+      <w:r>
+        <w:rPr>
+          <w:rFonts w:ascii="Cambria Math" w:hAnsi="Cambria Math" w:cstheme="minorHAnsi"/>
+          <w:iCs/>
+        </w:rPr>
+        <w:t>causal rational system has a pole at z=1.02. Can it be BIBO stable? Briefly justify.</w:t>
+      </w:r>
+      <w:r>
+        <w:rPr>
+          <w:rFonts w:ascii="Cambria Math" w:hAnsi="Cambria Math" w:cstheme="minorHAnsi"/>
+          <w:iCs/>
+        </w:rPr>
+        <w:t xml:space="preserve"> </w:t>
       </w:r>
     </w:p>
     <w:p>
       <w:pPr>
         <w:spacing w:after="80"/>
         <w:rPr>
-          <w:rFonts w:ascii="Cambria Math" w:hAnsi="Cambria Math" w:cstheme="minorHAnsi"/>
-          <w:iCs/>
+          <w:rFonts w:eastAsiaTheme="minorEastAsia" w:cstheme="minorHAnsi"/>
+          <w:bCs/>
+          <w:color w:val="EE0000"/>
         </w:rPr>
       </w:pPr>
       <w:r>
         <w:rPr>
-          <w:rFonts w:ascii="Cambria Math" w:hAnsi="Cambria Math" w:cstheme="minorHAnsi"/>
-          <w:iCs/>
-        </w:rPr>
-        <w:t xml:space="preserve">A </w:t>
-      </w:r>
-      <w:r>
-        <w:rPr>
-          <w:rFonts w:ascii="Cambria Math" w:hAnsi="Cambria Math" w:cstheme="minorHAnsi"/>
-          <w:iCs/>
-        </w:rPr>
-        <w:t>causal rational system has a pole at z=1.02. Can it be BIBO stable? Briefly justify.</w:t>
-      </w:r>
-      <w:r>
-        <w:rPr>
-          <w:rFonts w:ascii="Cambria Math" w:hAnsi="Cambria Math" w:cstheme="minorHAnsi"/>
-          <w:iCs/>
-        </w:rPr>
-        <w:t xml:space="preserve"> </w:t>
+          <w:rFonts w:eastAsiaTheme="minorEastAsia" w:cstheme="minorHAnsi"/>
+          <w:bCs/>
+          <w:color w:val="EE0000"/>
+        </w:rPr>
+        <w:t xml:space="preserve">For a causal system ROC is outside </w:t>
+      </w:r>
+      <w:r>
+        <w:rPr>
+          <w:rFonts w:eastAsiaTheme="minorEastAsia" w:cstheme="minorHAnsi"/>
+          <w:bCs/>
+          <w:color w:val="EE0000"/>
+        </w:rPr>
+        <w:t>the outermost</w:t>
+      </w:r>
+      <w:r>
+        <w:rPr>
+          <w:rFonts w:eastAsiaTheme="minorEastAsia" w:cstheme="minorHAnsi"/>
+          <w:bCs/>
+          <w:color w:val="EE0000"/>
+        </w:rPr>
+        <w:t xml:space="preserve"> pole, here ROC </w:t>
+      </w:r>
+      <m:oMath>
+        <m:d>
+          <m:dPr>
+            <m:begChr m:val="|"/>
+            <m:endChr m:val="|"/>
+            <m:ctrlPr>
+              <w:rPr>
+                <w:rFonts w:ascii="Cambria Math" w:eastAsiaTheme="minorEastAsia" w:hAnsi="Cambria Math" w:cstheme="minorHAnsi"/>
+                <w:bCs/>
+                <w:i/>
+                <w:color w:val="EE0000"/>
+              </w:rPr>
+            </m:ctrlPr>
+          </m:dPr>
+          <m:e>
+            <m:r>
+              <w:rPr>
+                <w:rFonts w:ascii="Cambria Math" w:eastAsiaTheme="minorEastAsia" w:hAnsi="Cambria Math" w:cstheme="minorHAnsi"/>
+                <w:color w:val="EE0000"/>
+              </w:rPr>
+              <m:t>z</m:t>
+            </m:r>
+          </m:e>
+        </m:d>
+        <m:r>
+          <w:rPr>
+            <w:rFonts w:ascii="Cambria Math" w:eastAsiaTheme="minorEastAsia" w:hAnsi="Cambria Math" w:cstheme="minorHAnsi"/>
+            <w:color w:val="EE0000"/>
+          </w:rPr>
+          <m:t>&gt;1.02</m:t>
+        </m:r>
+      </m:oMath>
+      <w:r>
+        <w:rPr>
+          <w:rFonts w:eastAsiaTheme="minorEastAsia" w:cstheme="minorHAnsi"/>
+          <w:bCs/>
+          <w:color w:val="EE0000"/>
+        </w:rPr>
+        <w:t>. This does not include unit circle =&gt; system cannot be BIBO stable.</w:t>
       </w:r>
     </w:p>
     <w:p>
@@ -756,15 +1176,7 @@
         <w:rPr>
           <w:rFonts w:eastAsiaTheme="minorEastAsia" w:cstheme="minorHAnsi"/>
           <w:bCs/>
-        </w:rPr>
-      </w:pPr>
-    </w:p>
-    <w:p>
-      <w:pPr>
-        <w:spacing w:after="80"/>
-        <w:rPr>
-          <w:rFonts w:eastAsiaTheme="minorEastAsia" w:cstheme="minorHAnsi"/>
-          <w:bCs/>
+          <w:color w:val="EE0000"/>
         </w:rPr>
       </w:pPr>
     </w:p>
@@ -897,14 +1309,312 @@
         <w:rPr>
           <w:rFonts w:eastAsiaTheme="minorEastAsia" w:cstheme="minorHAnsi"/>
           <w:bCs/>
+          <w:color w:val="EE0000"/>
         </w:rPr>
       </w:pPr>
       <w:r>
         <w:rPr>
           <w:rFonts w:eastAsiaTheme="minorEastAsia" w:cstheme="minorHAnsi"/>
           <w:bCs/>
+          <w:color w:val="EE0000"/>
+        </w:rPr>
+        <w:t xml:space="preserve">At a zero on the unit circle a numerator distance of </w:t>
+      </w:r>
+      <m:oMath>
+        <m:r>
+          <w:rPr>
+            <w:rFonts w:ascii="Cambria Math" w:eastAsiaTheme="minorEastAsia" w:hAnsi="Cambria Math" w:cstheme="minorHAnsi"/>
+            <w:color w:val="EE0000"/>
+          </w:rPr>
+          <m:t>|H</m:t>
+        </m:r>
+        <m:d>
+          <m:dPr>
+            <m:ctrlPr>
+              <w:rPr>
+                <w:rFonts w:ascii="Cambria Math" w:eastAsiaTheme="minorEastAsia" w:hAnsi="Cambria Math" w:cstheme="minorHAnsi"/>
+                <w:bCs/>
+                <w:i/>
+                <w:color w:val="EE0000"/>
+              </w:rPr>
+            </m:ctrlPr>
+          </m:dPr>
+          <m:e>
+            <m:sSup>
+              <m:sSupPr>
+                <m:ctrlPr>
+                  <w:rPr>
+                    <w:rFonts w:ascii="Cambria Math" w:eastAsiaTheme="minorEastAsia" w:hAnsi="Cambria Math" w:cstheme="minorHAnsi"/>
+                    <w:bCs/>
+                    <w:i/>
+                    <w:color w:val="EE0000"/>
+                  </w:rPr>
+                </m:ctrlPr>
+              </m:sSupPr>
+              <m:e>
+                <m:r>
+                  <w:rPr>
+                    <w:rFonts w:ascii="Cambria Math" w:eastAsiaTheme="minorEastAsia" w:hAnsi="Cambria Math" w:cstheme="minorHAnsi"/>
+                    <w:color w:val="EE0000"/>
+                  </w:rPr>
+                  <m:t>e</m:t>
+                </m:r>
+              </m:e>
+              <m:sup>
+                <m:r>
+                  <w:rPr>
+                    <w:rFonts w:ascii="Cambria Math" w:eastAsiaTheme="minorEastAsia" w:hAnsi="Cambria Math" w:cstheme="minorHAnsi"/>
+                    <w:color w:val="EE0000"/>
+                  </w:rPr>
+                  <m:t>jω</m:t>
+                </m:r>
+              </m:sup>
+            </m:sSup>
+          </m:e>
+        </m:d>
+        <m:r>
+          <w:rPr>
+            <w:rFonts w:ascii="Cambria Math" w:eastAsiaTheme="minorEastAsia" w:hAnsi="Cambria Math" w:cstheme="minorHAnsi"/>
+            <w:color w:val="EE0000"/>
+          </w:rPr>
+          <m:t>|</m:t>
+        </m:r>
+      </m:oMath>
+      <w:r>
+        <w:rPr>
+          <w:rFonts w:eastAsiaTheme="minorEastAsia" w:cstheme="minorHAnsi"/>
+          <w:bCs/>
+          <w:color w:val="EE0000"/>
         </w:rPr>
         <w:t xml:space="preserve"> </w:t>
+      </w:r>
+      <w:r>
+        <w:rPr>
+          <w:rFonts w:eastAsiaTheme="minorEastAsia" w:cstheme="minorHAnsi"/>
+          <w:bCs/>
+          <w:color w:val="EE0000"/>
+        </w:rPr>
+        <w:t xml:space="preserve">is zero so </w:t>
+      </w:r>
+      <m:oMath>
+        <m:d>
+          <m:dPr>
+            <m:begChr m:val="|"/>
+            <m:endChr m:val="|"/>
+            <m:ctrlPr>
+              <w:rPr>
+                <w:rFonts w:ascii="Cambria Math" w:eastAsiaTheme="minorEastAsia" w:hAnsi="Cambria Math" w:cstheme="minorHAnsi"/>
+                <w:bCs/>
+                <w:i/>
+                <w:color w:val="EE0000"/>
+              </w:rPr>
+            </m:ctrlPr>
+          </m:dPr>
+          <m:e>
+            <m:r>
+              <w:rPr>
+                <w:rFonts w:ascii="Cambria Math" w:eastAsiaTheme="minorEastAsia" w:hAnsi="Cambria Math" w:cstheme="minorHAnsi"/>
+                <w:color w:val="EE0000"/>
+              </w:rPr>
+              <m:t>H</m:t>
+            </m:r>
+            <m:d>
+              <m:dPr>
+                <m:ctrlPr>
+                  <w:rPr>
+                    <w:rFonts w:ascii="Cambria Math" w:eastAsiaTheme="minorEastAsia" w:hAnsi="Cambria Math" w:cstheme="minorHAnsi"/>
+                    <w:bCs/>
+                    <w:i/>
+                    <w:color w:val="EE0000"/>
+                  </w:rPr>
+                </m:ctrlPr>
+              </m:dPr>
+              <m:e>
+                <m:sSup>
+                  <m:sSupPr>
+                    <m:ctrlPr>
+                      <w:rPr>
+                        <w:rFonts w:ascii="Cambria Math" w:eastAsiaTheme="minorEastAsia" w:hAnsi="Cambria Math" w:cstheme="minorHAnsi"/>
+                        <w:bCs/>
+                        <w:i/>
+                        <w:color w:val="EE0000"/>
+                      </w:rPr>
+                    </m:ctrlPr>
+                  </m:sSupPr>
+                  <m:e>
+                    <m:r>
+                      <w:rPr>
+                        <w:rFonts w:ascii="Cambria Math" w:eastAsiaTheme="minorEastAsia" w:hAnsi="Cambria Math" w:cstheme="minorHAnsi"/>
+                        <w:color w:val="EE0000"/>
+                      </w:rPr>
+                      <m:t>e</m:t>
+                    </m:r>
+                  </m:e>
+                  <m:sup>
+                    <m:r>
+                      <w:rPr>
+                        <w:rFonts w:ascii="Cambria Math" w:eastAsiaTheme="minorEastAsia" w:hAnsi="Cambria Math" w:cstheme="minorHAnsi"/>
+                        <w:color w:val="EE0000"/>
+                      </w:rPr>
+                      <m:t>jω</m:t>
+                    </m:r>
+                  </m:sup>
+                </m:sSup>
+              </m:e>
+            </m:d>
+          </m:e>
+        </m:d>
+        <m:r>
+          <w:rPr>
+            <w:rFonts w:ascii="Cambria Math" w:eastAsiaTheme="minorEastAsia" w:hAnsi="Cambria Math" w:cstheme="minorHAnsi"/>
+            <w:color w:val="EE0000"/>
+          </w:rPr>
+          <m:t>=0</m:t>
+        </m:r>
+      </m:oMath>
+      <w:r>
+        <w:rPr>
+          <w:rFonts w:eastAsiaTheme="minorEastAsia" w:cstheme="minorHAnsi"/>
+          <w:bCs/>
+          <w:color w:val="EE0000"/>
+        </w:rPr>
+        <w:t xml:space="preserve"> (perfect notch). Near a pole close to the unit circle, a denominator distance of </w:t>
+      </w:r>
+      <m:oMath>
+        <m:r>
+          <w:rPr>
+            <w:rFonts w:ascii="Cambria Math" w:eastAsiaTheme="minorEastAsia" w:hAnsi="Cambria Math" w:cstheme="minorHAnsi"/>
+            <w:color w:val="EE0000"/>
+          </w:rPr>
+          <m:t>|H</m:t>
+        </m:r>
+        <m:d>
+          <m:dPr>
+            <m:ctrlPr>
+              <w:rPr>
+                <w:rFonts w:ascii="Cambria Math" w:eastAsiaTheme="minorEastAsia" w:hAnsi="Cambria Math" w:cstheme="minorHAnsi"/>
+                <w:bCs/>
+                <w:i/>
+                <w:color w:val="EE0000"/>
+              </w:rPr>
+            </m:ctrlPr>
+          </m:dPr>
+          <m:e>
+            <m:sSup>
+              <m:sSupPr>
+                <m:ctrlPr>
+                  <w:rPr>
+                    <w:rFonts w:ascii="Cambria Math" w:eastAsiaTheme="minorEastAsia" w:hAnsi="Cambria Math" w:cstheme="minorHAnsi"/>
+                    <w:bCs/>
+                    <w:i/>
+                    <w:color w:val="EE0000"/>
+                  </w:rPr>
+                </m:ctrlPr>
+              </m:sSupPr>
+              <m:e>
+                <m:r>
+                  <w:rPr>
+                    <w:rFonts w:ascii="Cambria Math" w:eastAsiaTheme="minorEastAsia" w:hAnsi="Cambria Math" w:cstheme="minorHAnsi"/>
+                    <w:color w:val="EE0000"/>
+                  </w:rPr>
+                  <m:t>e</m:t>
+                </m:r>
+              </m:e>
+              <m:sup>
+                <m:r>
+                  <w:rPr>
+                    <w:rFonts w:ascii="Cambria Math" w:eastAsiaTheme="minorEastAsia" w:hAnsi="Cambria Math" w:cstheme="minorHAnsi"/>
+                    <w:color w:val="EE0000"/>
+                  </w:rPr>
+                  <m:t>jω</m:t>
+                </m:r>
+              </m:sup>
+            </m:sSup>
+          </m:e>
+        </m:d>
+        <m:r>
+          <w:rPr>
+            <w:rFonts w:ascii="Cambria Math" w:eastAsiaTheme="minorEastAsia" w:hAnsi="Cambria Math" w:cstheme="minorHAnsi"/>
+            <w:color w:val="EE0000"/>
+          </w:rPr>
+          <m:t>|</m:t>
+        </m:r>
+      </m:oMath>
+      <w:r>
+        <w:rPr>
+          <w:rFonts w:eastAsiaTheme="minorEastAsia" w:cstheme="minorHAnsi"/>
+          <w:bCs/>
+          <w:color w:val="EE0000"/>
+        </w:rPr>
+        <w:t xml:space="preserve"> is small, so </w:t>
+      </w:r>
+      <m:oMath>
+        <m:r>
+          <w:rPr>
+            <w:rFonts w:ascii="Cambria Math" w:eastAsiaTheme="minorEastAsia" w:hAnsi="Cambria Math" w:cstheme="minorHAnsi"/>
+            <w:color w:val="EE0000"/>
+          </w:rPr>
+          <m:t>|H</m:t>
+        </m:r>
+        <m:d>
+          <m:dPr>
+            <m:ctrlPr>
+              <w:rPr>
+                <w:rFonts w:ascii="Cambria Math" w:eastAsiaTheme="minorEastAsia" w:hAnsi="Cambria Math" w:cstheme="minorHAnsi"/>
+                <w:bCs/>
+                <w:i/>
+                <w:color w:val="EE0000"/>
+              </w:rPr>
+            </m:ctrlPr>
+          </m:dPr>
+          <m:e>
+            <m:sSup>
+              <m:sSupPr>
+                <m:ctrlPr>
+                  <w:rPr>
+                    <w:rFonts w:ascii="Cambria Math" w:eastAsiaTheme="minorEastAsia" w:hAnsi="Cambria Math" w:cstheme="minorHAnsi"/>
+                    <w:bCs/>
+                    <w:i/>
+                    <w:color w:val="EE0000"/>
+                  </w:rPr>
+                </m:ctrlPr>
+              </m:sSupPr>
+              <m:e>
+                <m:r>
+                  <w:rPr>
+                    <w:rFonts w:ascii="Cambria Math" w:eastAsiaTheme="minorEastAsia" w:hAnsi="Cambria Math" w:cstheme="minorHAnsi"/>
+                    <w:color w:val="EE0000"/>
+                  </w:rPr>
+                  <m:t>e</m:t>
+                </m:r>
+              </m:e>
+              <m:sup>
+                <m:r>
+                  <w:rPr>
+                    <w:rFonts w:ascii="Cambria Math" w:eastAsiaTheme="minorEastAsia" w:hAnsi="Cambria Math" w:cstheme="minorHAnsi"/>
+                    <w:color w:val="EE0000"/>
+                  </w:rPr>
+                  <m:t>jω</m:t>
+                </m:r>
+              </m:sup>
+            </m:sSup>
+          </m:e>
+        </m:d>
+        <m:r>
+          <w:rPr>
+            <w:rFonts w:ascii="Cambria Math" w:eastAsiaTheme="minorEastAsia" w:hAnsi="Cambria Math" w:cstheme="minorHAnsi"/>
+            <w:color w:val="EE0000"/>
+          </w:rPr>
+          <m:t>|</m:t>
+        </m:r>
+      </m:oMath>
+      <w:r>
+        <w:rPr>
+          <w:rFonts w:eastAsiaTheme="minorEastAsia" w:cstheme="minorHAnsi"/>
+          <w:bCs/>
+          <w:color w:val="EE0000"/>
+        </w:rPr>
+        <w:t xml:space="preserve"> becomes large (resonant peak).</w:t>
       </w:r>
     </w:p>
     <w:p>

</xml_diff>